<commit_message>
Replace GitHub with latest local files
</commit_message>
<xml_diff>
--- a/Not Related data/Laptop Supabase.docx
+++ b/Not Related data/Laptop Supabase.docx
@@ -8,49 +8,15 @@
           <w:lang w:val="fil"/>
         </w:rPr>
       </w:pPr>
-      <w:r>
-        <w:rPr>
-          <w:lang w:val="fil"/>
-        </w:rPr>
-        <w:fldChar w:fldCharType="begin"/>
-      </w:r>
-      <w:r>
-        <w:rPr>
-          <w:lang w:val="fil"/>
-        </w:rPr>
-        <w:instrText>HYPERLINK "</w:instrText>
-      </w:r>
-      <w:r>
-        <w:rPr>
-          <w:lang w:val="fil"/>
-        </w:rPr>
-        <w:instrText>https://ldicorplan68-boop.github.io/LDI-Dashboard/dashboard.html</w:instrText>
-      </w:r>
-      <w:r>
-        <w:rPr>
-          <w:lang w:val="fil"/>
-        </w:rPr>
-        <w:instrText>"</w:instrText>
-      </w:r>
-      <w:r>
-        <w:rPr>
-          <w:lang w:val="fil"/>
-        </w:rPr>
-        <w:fldChar w:fldCharType="separate"/>
-      </w:r>
-      <w:r>
-        <w:rPr>
-          <w:rStyle w:val="Hyperlink"/>
-          <w:lang w:val="fil"/>
-        </w:rPr>
-        <w:t>https://ldicorplan68-boop.github.io/LDI-Dashboard/dashboard.html</w:t>
-      </w:r>
-      <w:r>
-        <w:rPr>
-          <w:lang w:val="fil"/>
-        </w:rPr>
-        <w:fldChar w:fldCharType="end"/>
-      </w:r>
+      <w:hyperlink r:id="rId4" w:history="1">
+        <w:r>
+          <w:rPr>
+            <w:rStyle w:val="Hyperlink"/>
+            <w:lang w:val="fil"/>
+          </w:rPr>
+          <w:t>https://ldicorplan68-boop.github.io/LDI-Dashboard/dashboard.html</w:t>
+        </w:r>
+      </w:hyperlink>
       <w:r>
         <w:rPr>
           <w:lang w:val="fil"/>
@@ -486,23 +452,8 @@
       </w:r>
       <w:r>
         <w:br/>
-      </w:r>
-      <w:r>
-        <w:t xml:space="preserve">const supabase = </w:t>
-      </w:r>
-      <w:proofErr w:type="gramStart"/>
-      <w:r>
-        <w:t>window.supabase</w:t>
-      </w:r>
-      <w:proofErr w:type="gramEnd"/>
-      <w:r>
-        <w:t>.</w:t>
-      </w:r>
-      <w:proofErr w:type="gramStart"/>
-      <w:r>
-        <w:t>createClient(</w:t>
-      </w:r>
-      <w:proofErr w:type="gramEnd"/>
+        <w:t>const supabase = window.supabase.createClient(</w:t>
+      </w:r>
     </w:p>
     <w:p>
       <w:r>
@@ -557,15 +508,34 @@
     <w:p/>
     <w:p>
       <w:r>
-        <w:t>sudo docker logs cloudflared 2&gt;&amp;1 | grep -E "https:/</w:t>
-      </w:r>
-      <w:proofErr w:type="gramStart"/>
-      <w:r>
-        <w:t>/.*</w:t>
-      </w:r>
-      <w:proofErr w:type="gramEnd"/>
-      <w:r>
-        <w:t>trycloudflare.com"</w:t>
+        <w:t xml:space="preserve">sudo docker logs cloudflared 2&gt;&amp;1 | grep -E </w:t>
+      </w:r>
+      <w:hyperlink r:id="rId5" w:history="1">
+        <w:r>
+          <w:rPr>
+            <w:rStyle w:val="Hyperlink"/>
+          </w:rPr>
+          <w:t>https://.*trycloudflare.com</w:t>
+        </w:r>
+      </w:hyperlink>
+      <w:r>
+        <w:br/>
+      </w:r>
+      <w:r>
+        <w:br/>
+      </w:r>
+      <w:r>
+        <w:br/>
+      </w:r>
+      <w:r>
+        <w:br/>
+        <w:t>eto kapag maglalagay ng new table or new column</w:t>
+      </w:r>
+      <w:r>
+        <w:br/>
+      </w:r>
+      <w:r>
+        <w:t>sudo docker exec -it supabase-db psql -U supabase_admin -d postgres</w:t>
       </w:r>
     </w:p>
     <w:sectPr>

</xml_diff>